<commit_message>
Practical 4: title page like other practicals, ER diagram rebuilt in draw.io
Co-Authored-By: Claude Sonnet 5.5 <noreply@anthropic.com>
Claude-Session: https://claude.ai/code/session_011DSASePq9E2J7c3UPJh5aF
</commit_message>
<xml_diff>
--- a/prakticheskie/Практическая_4.docx
+++ b/prakticheskie/Практическая_4.docx
@@ -3,8 +3,157 @@
 <w:document xmlns:wpc="http://schemas.microsoft.com/office/word/2010/wordprocessingCanvas" xmlns:mc="http://schemas.openxmlformats.org/markup-compatibility/2006" xmlns:o="urn:schemas-microsoft-com:office:office" xmlns:r="http://schemas.openxmlformats.org/officeDocument/2006/relationships" xmlns:m="http://schemas.openxmlformats.org/officeDocument/2006/math" xmlns:v="urn:schemas-microsoft-com:vml" xmlns:wp14="http://schemas.microsoft.com/office/word/2010/wordprocessingDrawing" xmlns:wp="http://schemas.openxmlformats.org/drawingml/2006/wordprocessingDrawing" xmlns:w10="urn:schemas-microsoft-com:office:word" xmlns:w="http://schemas.openxmlformats.org/wordprocessingml/2006/main" xmlns:w14="http://schemas.microsoft.com/office/word/2010/wordml" xmlns:w15="http://schemas.microsoft.com/office/word/2012/wordml" xmlns:wpg="http://schemas.microsoft.com/office/word/2010/wordprocessingGroup" xmlns:wpi="http://schemas.microsoft.com/office/word/2010/wordprocessingInk" xmlns:wne="http://schemas.microsoft.com/office/word/2006/wordml" xmlns:wps="http://schemas.microsoft.com/office/word/2010/wordprocessingShape" xmlns:cx="http://schemas.microsoft.com/office/drawing/2014/chartex" xmlns:cx1="http://schemas.microsoft.com/office/drawing/2015/9/8/chartex" xmlns:cx2="http://schemas.microsoft.com/office/drawing/2015/10/21/chartex" xmlns:cx3="http://schemas.microsoft.com/office/drawing/2016/5/9/chartex" xmlns:cx4="http://schemas.microsoft.com/office/drawing/2016/5/10/chartex" xmlns:cx5="http://schemas.microsoft.com/office/drawing/2016/5/11/chartex" xmlns:cx6="http://schemas.microsoft.com/office/drawing/2016/5/12/chartex" xmlns:cx7="http://schemas.microsoft.com/office/drawing/2016/5/13/chartex" xmlns:cx8="http://schemas.microsoft.com/office/drawing/2016/5/14/chartex" xmlns:aink="http://schemas.microsoft.com/office/drawing/2016/ink" xmlns:am3d="http://schemas.microsoft.com/office/drawing/2017/model3d" xmlns:w16cex="http://schemas.microsoft.com/office/word/2018/wordml/cex" xmlns:w16cid="http://schemas.microsoft.com/office/word/2016/wordml/cid" xmlns:w16="http://schemas.microsoft.com/office/word/2018/wordml" xmlns:w16sdtdh="http://schemas.microsoft.com/office/word/2020/wordml/sdtdatahash" xmlns:w16se="http://schemas.microsoft.com/office/word/2015/wordml/symex" mc:Ignorable="w14 w15 wp14">
   <w:body>
     <w:p>
+      <w:r>
+        <w:drawing>
+          <wp:inline xmlns:a="http://schemas.openxmlformats.org/drawingml/2006/main" xmlns:pic="http://schemas.openxmlformats.org/drawingml/2006/picture">
+            <wp:extent cx="5915025" cy="1085850"/>
+            <wp:docPr id="2" name="Picture 2"/>
+            <wp:cNvGraphicFramePr>
+              <a:graphicFrameLocks noChangeAspect="1"/>
+            </wp:cNvGraphicFramePr>
+            <a:graphic>
+              <a:graphicData uri="http://schemas.openxmlformats.org/drawingml/2006/picture">
+                <pic:pic>
+                  <pic:nvPicPr>
+                    <pic:cNvPr id="0" name="image.png"/>
+                    <pic:cNvPicPr/>
+                  </pic:nvPicPr>
+                  <pic:blipFill>
+                    <a:blip r:embed="rId9"/>
+                    <a:stretch>
+                      <a:fillRect/>
+                    </a:stretch>
+                  </pic:blipFill>
+                  <pic:spPr>
+                    <a:xfrm>
+                      <a:off x="0" y="0"/>
+                      <a:ext cx="5915025" cy="1085850"/>
+                    </a:xfrm>
+                    <a:prstGeom prst="rect"/>
+                  </pic:spPr>
+                </pic:pic>
+              </a:graphicData>
+            </a:graphic>
+          </wp:inline>
+        </w:drawing>
+      </w:r>
+    </w:p>
+    <w:p>
       <w:pPr>
-        <w:spacing w:line="360"/>
+        <w:spacing w:after="3120"/>
+      </w:pPr>
+      <w:r>
+        <w:rPr>
+          <w:rFonts w:ascii="Times New Roman" w:cs="Times New Roman" w:eastAsia="Times New Roman" w:hAnsi="Times New Roman"/>
+          <w:b/>
+          <w:bCs/>
+          <w:i/>
+          <w:iCs/>
+          <w:sz w:val="28"/>
+          <w:szCs w:val="28"/>
+        </w:rPr>
+        <w:t xml:space="preserve">Дисциплина: МДК.09.02</w:t>
+      </w:r>
+    </w:p>
+    <w:p>
+      <w:pPr>
+        <w:spacing w:after="2400" w:line="360"/>
+        <w:jc w:val="center"/>
+      </w:pPr>
+      <w:r>
+        <w:rPr>
+          <w:rFonts w:ascii="Times New Roman" w:cs="Times New Roman" w:eastAsia="Times New Roman" w:hAnsi="Times New Roman"/>
+          <w:b/>
+          <w:bCs/>
+          <w:sz w:val="32"/>
+          <w:szCs w:val="32"/>
+        </w:rPr>
+        <w:t>Отчет по выполнению задания на тему: «Создание ER-диаграммы для веб-приложения (ПР4)».</w:t>
+      </w:r>
+    </w:p>
+    <w:p>
+      <w:pPr>
+        <w:spacing w:before="0" w:line="360"/>
+        <w:ind w:left="5103"/>
+      </w:pPr>
+      <w:r>
+        <w:rPr>
+          <w:rFonts w:ascii="Times New Roman" w:cs="Times New Roman" w:eastAsia="Times New Roman" w:hAnsi="Times New Roman"/>
+          <w:sz w:val="28"/>
+          <w:szCs w:val="28"/>
+        </w:rPr>
+        <w:t xml:space="preserve">Выполнила:</w:t>
+      </w:r>
+    </w:p>
+    <w:p>
+      <w:pPr>
+        <w:spacing w:before="0" w:line="360"/>
+        <w:ind w:left="5103"/>
+      </w:pPr>
+      <w:r>
+        <w:rPr>
+          <w:rFonts w:ascii="Times New Roman" w:cs="Times New Roman" w:eastAsia="Times New Roman" w:hAnsi="Times New Roman"/>
+          <w:sz w:val="28"/>
+          <w:szCs w:val="28"/>
+        </w:rPr>
+        <w:t xml:space="preserve">Группа: </w:t>
+      </w:r>
+      <w:r>
+        <w:rPr>
+          <w:rFonts w:ascii="Times New Roman" w:cs="Times New Roman" w:eastAsia="Times New Roman" w:hAnsi="Times New Roman"/>
+          <w:b/>
+          <w:bCs/>
+          <w:sz w:val="28"/>
+          <w:szCs w:val="28"/>
+        </w:rPr>
+        <w:t xml:space="preserve">4ИСП9-45</w:t>
+      </w:r>
+    </w:p>
+    <w:p>
+      <w:pPr>
+        <w:spacing w:before="0" w:line="360"/>
+        <w:ind w:left="5103"/>
+      </w:pPr>
+      <w:r>
+        <w:rPr>
+          <w:rFonts w:ascii="Times New Roman" w:cs="Times New Roman" w:eastAsia="Times New Roman" w:hAnsi="Times New Roman"/>
+          <w:sz w:val="28"/>
+          <w:szCs w:val="28"/>
+        </w:rPr>
+        <w:t xml:space="preserve">Студент:</w:t>
+      </w:r>
+    </w:p>
+    <w:p>
+      <w:pPr>
+        <w:spacing w:before="360" w:line="360"/>
+        <w:ind w:left="5103"/>
+      </w:pPr>
+      <w:r>
+        <w:rPr>
+          <w:rFonts w:ascii="Times New Roman" w:cs="Times New Roman" w:eastAsia="Times New Roman" w:hAnsi="Times New Roman"/>
+          <w:sz w:val="28"/>
+          <w:szCs w:val="28"/>
+        </w:rPr>
+        <w:t xml:space="preserve">Проверил преподаватель:</w:t>
+      </w:r>
+    </w:p>
+    <w:p>
+      <w:pPr>
+        <w:spacing w:before="0" w:line="360"/>
+        <w:ind w:left="6403"/>
+      </w:pPr>
+      <w:r>
+        <w:rPr>
+          <w:rFonts w:ascii="Times New Roman" w:cs="Times New Roman" w:eastAsia="Times New Roman" w:hAnsi="Times New Roman"/>
+          <w:sz w:val="28"/>
+          <w:szCs w:val="28"/>
+        </w:rPr>
+        <w:t xml:space="preserve">Полковникова Н. В.</w:t>
+      </w:r>
+    </w:p>
+    <w:p>
+      <w:pPr>
+        <w:spacing w:before="1400"/>
         <w:jc w:val="center"/>
       </w:pPr>
       <w:r>
@@ -13,212 +162,7 @@
           <w:sz w:val="28"/>
           <w:szCs w:val="28"/>
         </w:rPr>
-        <w:t xml:space="preserve">МИНИСТЕРСТВО ОБРАЗОВАНИЯ И НАУКИ</w:t>
-      </w:r>
-    </w:p>
-    <w:p>
-      <w:pPr>
-        <w:spacing w:line="360"/>
-        <w:jc w:val="center"/>
-      </w:pPr>
-      <w:r>
-        <w:rPr>
-          <w:rFonts w:ascii="Times New Roman" w:cs="Times New Roman" w:eastAsia="Times New Roman" w:hAnsi="Times New Roman"/>
-          <w:sz w:val="28"/>
-          <w:szCs w:val="28"/>
-        </w:rPr>
-        <w:t xml:space="preserve">Наименование образовательной организации</w:t>
-      </w:r>
-    </w:p>
-    <w:p>
-      <w:pPr>
-        <w:spacing w:after="120"/>
-      </w:pPr>
-    </w:p>
-    <w:p>
-      <w:pPr>
-        <w:spacing w:after="120"/>
-      </w:pPr>
-    </w:p>
-    <w:p>
-      <w:pPr>
-        <w:spacing w:after="120"/>
-      </w:pPr>
-    </w:p>
-    <w:p>
-      <w:pPr>
-        <w:spacing w:after="120"/>
-      </w:pPr>
-    </w:p>
-    <w:p>
-      <w:pPr>
-        <w:spacing w:after="120"/>
-      </w:pPr>
-    </w:p>
-    <w:p>
-      <w:pPr>
-        <w:spacing w:line="360"/>
-        <w:jc w:val="center"/>
-      </w:pPr>
-      <w:r>
-        <w:rPr>
-          <w:rFonts w:ascii="Times New Roman" w:cs="Times New Roman" w:eastAsia="Times New Roman" w:hAnsi="Times New Roman"/>
-          <w:b/>
-          <w:bCs/>
-          <w:sz w:val="36"/>
-          <w:szCs w:val="36"/>
-        </w:rPr>
-        <w:t xml:space="preserve">ОТЧЁТ</w:t>
-      </w:r>
-    </w:p>
-    <w:p>
-      <w:pPr>
-        <w:spacing w:line="360"/>
-        <w:jc w:val="center"/>
-      </w:pPr>
-      <w:r>
-        <w:rPr>
-          <w:rFonts w:ascii="Times New Roman" w:cs="Times New Roman" w:eastAsia="Times New Roman" w:hAnsi="Times New Roman"/>
-          <w:sz w:val="28"/>
-          <w:szCs w:val="28"/>
-        </w:rPr>
-        <w:t xml:space="preserve">по практической работе</w:t>
-      </w:r>
-    </w:p>
-    <w:p>
-      <w:pPr>
-        <w:spacing w:line="360"/>
-        <w:jc w:val="center"/>
-      </w:pPr>
-      <w:r>
-        <w:rPr>
-          <w:rFonts w:ascii="Times New Roman" w:cs="Times New Roman" w:eastAsia="Times New Roman" w:hAnsi="Times New Roman"/>
-          <w:b/>
-          <w:bCs/>
-          <w:sz w:val="28"/>
-          <w:szCs w:val="28"/>
-        </w:rPr>
-        <w:t xml:space="preserve">Тема: «Создание ER-диаграммы для веб-приложения»</w:t>
-      </w:r>
-    </w:p>
-    <w:p>
-      <w:pPr>
-        <w:spacing w:line="360"/>
-        <w:jc w:val="center"/>
-      </w:pPr>
-      <w:r>
-        <w:rPr>
-          <w:rFonts w:ascii="Times New Roman" w:cs="Times New Roman" w:eastAsia="Times New Roman" w:hAnsi="Times New Roman"/>
-          <w:sz w:val="28"/>
-          <w:szCs w:val="28"/>
-        </w:rPr>
-        <w:t xml:space="preserve">(на примере веб-приложения «Онлайн-библиотека»)</w:t>
-      </w:r>
-    </w:p>
-    <w:p>
-      <w:pPr>
-        <w:spacing w:after="120"/>
-      </w:pPr>
-    </w:p>
-    <w:p>
-      <w:pPr>
-        <w:spacing w:after="120"/>
-      </w:pPr>
-    </w:p>
-    <w:p>
-      <w:pPr>
-        <w:spacing w:after="120"/>
-      </w:pPr>
-    </w:p>
-    <w:p>
-      <w:pPr>
-        <w:spacing w:after="120"/>
-      </w:pPr>
-    </w:p>
-    <w:p>
-      <w:pPr>
-        <w:spacing w:after="120"/>
-      </w:pPr>
-    </w:p>
-    <w:p>
-      <w:pPr>
-        <w:spacing w:after="120"/>
-      </w:pPr>
-    </w:p>
-    <w:p>
-      <w:pPr>
-        <w:spacing w:line="360"/>
-        <w:jc w:val="right"/>
-      </w:pPr>
-      <w:r>
-        <w:rPr>
-          <w:rFonts w:ascii="Times New Roman" w:cs="Times New Roman" w:eastAsia="Times New Roman" w:hAnsi="Times New Roman"/>
-          <w:sz w:val="28"/>
-          <w:szCs w:val="28"/>
-        </w:rPr>
-        <w:t xml:space="preserve">Выполнил: ФИО студента</w:t>
-      </w:r>
-    </w:p>
-    <w:p>
-      <w:pPr>
-        <w:spacing w:line="360"/>
-        <w:jc w:val="right"/>
-      </w:pPr>
-      <w:r>
-        <w:rPr>
-          <w:rFonts w:ascii="Times New Roman" w:cs="Times New Roman" w:eastAsia="Times New Roman" w:hAnsi="Times New Roman"/>
-          <w:sz w:val="28"/>
-          <w:szCs w:val="28"/>
-        </w:rPr>
-        <w:t xml:space="preserve">Группа: ______</w:t>
-      </w:r>
-    </w:p>
-    <w:p>
-      <w:pPr>
-        <w:spacing w:line="360"/>
-        <w:jc w:val="right"/>
-      </w:pPr>
-      <w:r>
-        <w:rPr>
-          <w:rFonts w:ascii="Times New Roman" w:cs="Times New Roman" w:eastAsia="Times New Roman" w:hAnsi="Times New Roman"/>
-          <w:sz w:val="28"/>
-          <w:szCs w:val="28"/>
-        </w:rPr>
-        <w:t xml:space="preserve">Проверил: ФИО преподавателя</w:t>
-      </w:r>
-    </w:p>
-    <w:p>
-      <w:pPr>
-        <w:spacing w:after="120"/>
-      </w:pPr>
-    </w:p>
-    <w:p>
-      <w:pPr>
-        <w:spacing w:after="120"/>
-      </w:pPr>
-    </w:p>
-    <w:p>
-      <w:pPr>
-        <w:spacing w:after="120"/>
-      </w:pPr>
-    </w:p>
-    <w:p>
-      <w:pPr>
-        <w:spacing w:after="120"/>
-      </w:pPr>
-    </w:p>
-    <w:p>
-      <w:pPr>
-        <w:spacing w:line="360"/>
-        <w:jc w:val="center"/>
-      </w:pPr>
-      <w:r>
-        <w:rPr>
-          <w:rFonts w:ascii="Times New Roman" w:cs="Times New Roman" w:eastAsia="Times New Roman" w:hAnsi="Times New Roman"/>
-          <w:sz w:val="28"/>
-          <w:szCs w:val="28"/>
-        </w:rPr>
-        <w:t xml:space="preserve">Москва, 2026</w:t>
+        <w:t xml:space="preserve">Москва 2026 г.</w:t>
       </w:r>
     </w:p>
     <w:p>
@@ -254,7 +198,7 @@
           <w:sz w:val="28"/>
           <w:szCs w:val="28"/>
         </w:rPr>
-        <w:t xml:space="preserve">Получить практические навыки проектирования структуры базы данных веб-приложения с помощью ER-диаграммы: выделять сущности, атрибуты, связи и кардинальности и переходить от предметной области к концептуальной модели данных. Диаграмма построена в инструменте Graphviz; её можно воспроизвести в draw.io или dbdiagram.io по приведённым ниже таблицам.</w:t>
+        <w:t>Получить практические навыки проектирования структуры базы данных веб-приложения с помощью ER-диаграммы: выделять сущности, атрибуты, связи и кардинальности и переходить от предметной области к концептуальной модели данных. Диаграмма построена в инструменте draw.io (файл ER-диаграмма_онлайн-библиотека.drawio); её можно воспроизвести по приведённым ниже таблицам.</w:t>
       </w:r>
     </w:p>
     <w:p>
@@ -8694,29 +8638,13 @@
     </w:p>
     <w:p>
       <w:pPr>
-        <w:spacing w:line="360"/>
-        <w:jc w:val="center"/>
-      </w:pPr>
-      <w:r>
-        <w:rPr>
-          <w:rFonts w:ascii="Times New Roman" w:cs="Times New Roman" w:eastAsia="Times New Roman" w:hAnsi="Times New Roman"/>
-          <w:i/>
-          <w:iCs/>
-          <w:sz w:val="24"/>
-          <w:szCs w:val="24"/>
-        </w:rPr>
-        <w:t xml:space="preserve">Рисунок 1 — ER-диаграмма веб-приложения «Онлайн-библиотека»</w:t>
-      </w:r>
-    </w:p>
-    <w:p>
-      <w:pPr>
         <w:spacing w:before="100"/>
         <w:jc w:val="center"/>
       </w:pPr>
       <w:r>
         <w:drawing>
           <wp:inline distT="0" distB="0" distL="0" distR="0">
-            <wp:extent cx="4095750" cy="5848350"/>
+            <wp:extent cx="4500000" cy="6594921"/>
             <wp:effectExtent t="0" r="0" b="0" l="0"/>
             <wp:docPr id="1" name="er" descr="ER-диаграмма онлайн-библиотеки" title="ER-диаграмма"/>
             <wp:cNvGraphicFramePr>
@@ -8741,7 +8669,7 @@
                   <pic:spPr bwMode="auto">
                     <a:xfrm>
                       <a:off x="0" y="0"/>
-                      <a:ext cx="4095750" cy="5848350"/>
+                      <a:ext cx="4500000" cy="6594921"/>
                     </a:xfrm>
                     <a:prstGeom prst="rect">
                       <a:avLst/>
@@ -8752,6 +8680,22 @@
             </a:graphic>
           </wp:inline>
         </w:drawing>
+      </w:r>
+    </w:p>
+    <w:p>
+      <w:pPr>
+        <w:spacing w:line="360"/>
+        <w:jc w:val="center"/>
+      </w:pPr>
+      <w:r>
+        <w:rPr>
+          <w:rFonts w:ascii="Times New Roman" w:cs="Times New Roman" w:eastAsia="Times New Roman" w:hAnsi="Times New Roman"/>
+          <w:i/>
+          <w:iCs/>
+          <w:sz w:val="24"/>
+          <w:szCs w:val="24"/>
+        </w:rPr>
+        <w:t xml:space="preserve">Рисунок 1 — ER-диаграмма веб-приложения «Онлайн-библиотека»</w:t>
       </w:r>
     </w:p>
     <w:p>

</xml_diff>